<commit_message>
added troparia to g for November
</commit_message>
<xml_diff>
--- a/flow/20230914_vu_template/drafts/2023-11-u/02-ЧТ-мчч. Акиндина та ін..docx
+++ b/flow/20230914_vu_template/drafts/2023-11-u/02-ЧТ-мчч. Акиндина та ін..docx
@@ -5903,6 +5903,55 @@
       </w:r>
     </w:p>
     <w:p>
+      <w:pPr/>
+      <w:r>
+        <w:rPr>
+          <w:rFonts w:ascii="Times New Roman" w:hAnsi="Times New Roman"/>
+          <w:i/>
+          <w:color w:val="FF0000"/>
+          <w:sz w:val="24"/>
+        </w:rPr>
+        <w:t>Тропар (г. 2):</w:t>
+      </w:r>
+      <w:r>
+        <w:rPr>
+          <w:rFonts w:ascii="Times New Roman" w:hAnsi="Times New Roman"/>
+          <w:color w:val="FF0000"/>
+          <w:sz w:val="24"/>
+        </w:rPr>
+        <w:t xml:space="preserve"> </w:t>
+      </w:r>
+      <w:r>
+        <w:rPr>
+          <w:rFonts w:ascii="Times New Roman" w:hAnsi="Times New Roman"/>
+          <w:color w:val="000000"/>
+          <w:sz w:val="24"/>
+        </w:rPr>
+        <w:t>Страстотерпці Господні, блаженна земля напоїлася кро</w:t>
+      </w:r>
+      <w:r>
+        <w:rPr>
+          <w:rFonts w:ascii="Times New Roman" w:hAnsi="Times New Roman"/>
+          <w:color w:val="000000"/>
+          <w:sz w:val="24"/>
+        </w:rPr>
+        <w:t xml:space="preserve">в’ю вашою,* і святі оселі прийняли тіла ваші,* бо ви ворога перемогли і Христа зі сміливістю проповідували.* Його ж, як благого, моліть, молимося, щоб спаслися душі наші. </w:t>
+      </w:r>
+    </w:p>
+    <w:p>
+      <w:pPr/>
+      <w:r>
+        <w:rPr>
+          <w:b/>
+        </w:rPr>
+        <w:t xml:space="preserve">Слава, і нині: </w:t>
+      </w:r>
+      <w:r>
+        <w:rPr/>
+        <w:t>богородичний</w:t>
+      </w:r>
+    </w:p>
+    <w:p>
       <w:pPr>
         <w:pStyle w:val="Heading3"/>
         <w:spacing w:after="120" w:before="0" w:lineRule="auto"/>
@@ -10795,10 +10844,9 @@
           <w:rFonts w:ascii="Times New Roman" w:cs="Times New Roman" w:eastAsia="Times New Roman" w:hAnsi="Times New Roman"/>
           <w:i w:val="1"/>
           <w:color w:val="ff0000"/>
-          <w:highlight w:val="yellow"/>
-          <w:rtl w:val="0"/>
-        </w:rPr>
-        <w:t xml:space="preserve">???</w:t>
+          <w:rtl w:val="0"/>
+        </w:rPr>
+        <w:t>2</w:t>
       </w:r>
       <w:r>
         <w:rPr>
@@ -11190,6 +11238,55 @@
       </w:r>
     </w:p>
     <w:p>
+      <w:pPr/>
+      <w:r>
+        <w:rPr>
+          <w:rFonts w:ascii="Times New Roman" w:hAnsi="Times New Roman"/>
+          <w:i/>
+          <w:color w:val="FF0000"/>
+          <w:sz w:val="24"/>
+        </w:rPr>
+        <w:t>Тропар (г. 2):</w:t>
+      </w:r>
+      <w:r>
+        <w:rPr>
+          <w:rFonts w:ascii="Times New Roman" w:hAnsi="Times New Roman"/>
+          <w:color w:val="FF0000"/>
+          <w:sz w:val="24"/>
+        </w:rPr>
+        <w:t xml:space="preserve"> </w:t>
+      </w:r>
+      <w:r>
+        <w:rPr>
+          <w:rFonts w:ascii="Times New Roman" w:hAnsi="Times New Roman"/>
+          <w:color w:val="000000"/>
+          <w:sz w:val="24"/>
+        </w:rPr>
+        <w:t>Страстотерпці Господні, блаженна земля напоїлася кро</w:t>
+      </w:r>
+      <w:r>
+        <w:rPr>
+          <w:rFonts w:ascii="Times New Roman" w:hAnsi="Times New Roman"/>
+          <w:color w:val="000000"/>
+          <w:sz w:val="24"/>
+        </w:rPr>
+        <w:t xml:space="preserve">в’ю вашою,* і святі оселі прийняли тіла ваші,* бо ви ворога перемогли і Христа зі сміливістю проповідували.* Його ж, як благого, моліть, молимося, щоб спаслися душі наші. </w:t>
+      </w:r>
+    </w:p>
+    <w:p>
+      <w:pPr/>
+      <w:r>
+        <w:rPr>
+          <w:b/>
+        </w:rPr>
+        <w:t xml:space="preserve">Слава, і нині: </w:t>
+      </w:r>
+      <w:r>
+        <w:rPr/>
+        <w:t>богородичний</w:t>
+      </w:r>
+    </w:p>
+    <w:p>
       <w:pPr>
         <w:pStyle w:val="Heading3"/>
         <w:spacing w:after="120" w:before="0" w:lineRule="auto"/>
@@ -11664,6 +11761,55 @@
       </w:r>
     </w:p>
     <w:p>
+      <w:pPr/>
+      <w:r>
+        <w:rPr>
+          <w:rFonts w:ascii="Times New Roman" w:hAnsi="Times New Roman"/>
+          <w:i/>
+          <w:color w:val="FF0000"/>
+          <w:sz w:val="24"/>
+        </w:rPr>
+        <w:t>Тропар (г. 2):</w:t>
+      </w:r>
+      <w:r>
+        <w:rPr>
+          <w:rFonts w:ascii="Times New Roman" w:hAnsi="Times New Roman"/>
+          <w:color w:val="FF0000"/>
+          <w:sz w:val="24"/>
+        </w:rPr>
+        <w:t xml:space="preserve"> </w:t>
+      </w:r>
+      <w:r>
+        <w:rPr>
+          <w:rFonts w:ascii="Times New Roman" w:hAnsi="Times New Roman"/>
+          <w:color w:val="000000"/>
+          <w:sz w:val="24"/>
+        </w:rPr>
+        <w:t>Страстотерпці Господні, блаженна земля напоїлася кро</w:t>
+      </w:r>
+      <w:r>
+        <w:rPr>
+          <w:rFonts w:ascii="Times New Roman" w:hAnsi="Times New Roman"/>
+          <w:color w:val="000000"/>
+          <w:sz w:val="24"/>
+        </w:rPr>
+        <w:t xml:space="preserve">в’ю вашою,* і святі оселі прийняли тіла ваші,* бо ви ворога перемогли і Христа зі сміливістю проповідували.* Його ж, як благого, моліть, молимося, щоб спаслися душі наші. </w:t>
+      </w:r>
+    </w:p>
+    <w:p>
+      <w:pPr/>
+      <w:r>
+        <w:rPr>
+          <w:b/>
+        </w:rPr>
+        <w:t xml:space="preserve">Слава, і нині: </w:t>
+      </w:r>
+      <w:r>
+        <w:rPr/>
+        <w:t>богородичний</w:t>
+      </w:r>
+    </w:p>
+    <w:p>
       <w:pPr>
         <w:pStyle w:val="Heading3"/>
         <w:spacing w:after="120" w:before="0" w:lineRule="auto"/>
@@ -12662,6 +12808,55 @@
       </w:r>
     </w:p>
     <w:p>
+      <w:pPr/>
+      <w:r>
+        <w:rPr>
+          <w:rFonts w:ascii="Times New Roman" w:hAnsi="Times New Roman"/>
+          <w:i/>
+          <w:color w:val="FF0000"/>
+          <w:sz w:val="24"/>
+        </w:rPr>
+        <w:t>Тропар (г. 2):</w:t>
+      </w:r>
+      <w:r>
+        <w:rPr>
+          <w:rFonts w:ascii="Times New Roman" w:hAnsi="Times New Roman"/>
+          <w:color w:val="FF0000"/>
+          <w:sz w:val="24"/>
+        </w:rPr>
+        <w:t xml:space="preserve"> </w:t>
+      </w:r>
+      <w:r>
+        <w:rPr>
+          <w:rFonts w:ascii="Times New Roman" w:hAnsi="Times New Roman"/>
+          <w:color w:val="000000"/>
+          <w:sz w:val="24"/>
+        </w:rPr>
+        <w:t>Страстотерпці Господні, блаженна земля напоїлася кро</w:t>
+      </w:r>
+      <w:r>
+        <w:rPr>
+          <w:rFonts w:ascii="Times New Roman" w:hAnsi="Times New Roman"/>
+          <w:color w:val="000000"/>
+          <w:sz w:val="24"/>
+        </w:rPr>
+        <w:t xml:space="preserve">в’ю вашою,* і святі оселі прийняли тіла ваші,* бо ви ворога перемогли і Христа зі сміливістю проповідували.* Його ж, як благого, моліть, молимося, щоб спаслися душі наші. </w:t>
+      </w:r>
+    </w:p>
+    <w:p>
+      <w:pPr/>
+      <w:r>
+        <w:rPr>
+          <w:b/>
+        </w:rPr>
+        <w:t xml:space="preserve">Слава, і нині: </w:t>
+      </w:r>
+      <w:r>
+        <w:rPr/>
+        <w:t>богородичний</w:t>
+      </w:r>
+    </w:p>
+    <w:p>
       <w:pPr>
         <w:pStyle w:val="Heading3"/>
         <w:spacing w:after="120" w:before="0" w:lineRule="auto"/>
@@ -13045,6 +13240,55 @@
       </w:r>
     </w:p>
     <w:p>
+      <w:pPr/>
+      <w:r>
+        <w:rPr>
+          <w:rFonts w:ascii="Times New Roman" w:hAnsi="Times New Roman"/>
+          <w:i/>
+          <w:color w:val="FF0000"/>
+          <w:sz w:val="24"/>
+        </w:rPr>
+        <w:t>Тропар (г. 2):</w:t>
+      </w:r>
+      <w:r>
+        <w:rPr>
+          <w:rFonts w:ascii="Times New Roman" w:hAnsi="Times New Roman"/>
+          <w:color w:val="FF0000"/>
+          <w:sz w:val="24"/>
+        </w:rPr>
+        <w:t xml:space="preserve"> </w:t>
+      </w:r>
+      <w:r>
+        <w:rPr>
+          <w:rFonts w:ascii="Times New Roman" w:hAnsi="Times New Roman"/>
+          <w:color w:val="000000"/>
+          <w:sz w:val="24"/>
+        </w:rPr>
+        <w:t>Страстотерпці Господні, блаженна земля напоїлася кро</w:t>
+      </w:r>
+      <w:r>
+        <w:rPr>
+          <w:rFonts w:ascii="Times New Roman" w:hAnsi="Times New Roman"/>
+          <w:color w:val="000000"/>
+          <w:sz w:val="24"/>
+        </w:rPr>
+        <w:t xml:space="preserve">в’ю вашою,* і святі оселі прийняли тіла ваші,* бо ви ворога перемогли і Христа зі сміливістю проповідували.* Його ж, як благого, моліть, молимося, щоб спаслися душі наші. </w:t>
+      </w:r>
+    </w:p>
+    <w:p>
+      <w:pPr/>
+      <w:r>
+        <w:rPr>
+          <w:b/>
+        </w:rPr>
+        <w:t xml:space="preserve">Слава, і нині: </w:t>
+      </w:r>
+      <w:r>
+        <w:rPr/>
+        <w:t>богородичний</w:t>
+      </w:r>
+    </w:p>
+    <w:p>
       <w:pPr>
         <w:pStyle w:val="Heading3"/>
         <w:spacing w:after="120" w:before="0" w:lineRule="auto"/>
@@ -13967,6 +14211,55 @@
         <w:rPr>
           <w:rtl w:val="0"/>
         </w:rPr>
+      </w:r>
+    </w:p>
+    <w:p>
+      <w:pPr/>
+      <w:r>
+        <w:rPr>
+          <w:rFonts w:ascii="Times New Roman" w:hAnsi="Times New Roman"/>
+          <w:i/>
+          <w:color w:val="FF0000"/>
+          <w:sz w:val="24"/>
+        </w:rPr>
+        <w:t>Тропар (г. 2):</w:t>
+      </w:r>
+      <w:r>
+        <w:rPr>
+          <w:rFonts w:ascii="Times New Roman" w:hAnsi="Times New Roman"/>
+          <w:color w:val="FF0000"/>
+          <w:sz w:val="24"/>
+        </w:rPr>
+        <w:t xml:space="preserve"> </w:t>
+      </w:r>
+      <w:r>
+        <w:rPr>
+          <w:rFonts w:ascii="Times New Roman" w:hAnsi="Times New Roman"/>
+          <w:color w:val="000000"/>
+          <w:sz w:val="24"/>
+        </w:rPr>
+        <w:t>Страстотерпці Господні, блаженна земля напоїлася кро</w:t>
+      </w:r>
+      <w:r>
+        <w:rPr>
+          <w:rFonts w:ascii="Times New Roman" w:hAnsi="Times New Roman"/>
+          <w:color w:val="000000"/>
+          <w:sz w:val="24"/>
+        </w:rPr>
+        <w:t xml:space="preserve">в’ю вашою,* і святі оселі прийняли тіла ваші,* бо ви ворога перемогли і Христа зі сміливістю проповідували.* Його ж, як благого, моліть, молимося, щоб спаслися душі наші. </w:t>
+      </w:r>
+    </w:p>
+    <w:p>
+      <w:pPr/>
+      <w:r>
+        <w:rPr>
+          <w:b/>
+        </w:rPr>
+        <w:t xml:space="preserve">Слава, і нині: </w:t>
+      </w:r>
+      <w:r>
+        <w:rPr/>
+        <w:t>богородичний</w:t>
       </w:r>
     </w:p>
     <w:p>
@@ -17270,6 +17563,55 @@
         <w:rPr>
           <w:rtl w:val="0"/>
         </w:rPr>
+      </w:r>
+    </w:p>
+    <w:p>
+      <w:pPr/>
+      <w:r>
+        <w:rPr>
+          <w:rFonts w:ascii="Times New Roman" w:hAnsi="Times New Roman"/>
+          <w:i/>
+          <w:color w:val="FF0000"/>
+          <w:sz w:val="24"/>
+        </w:rPr>
+        <w:t>Тропар (г. 2):</w:t>
+      </w:r>
+      <w:r>
+        <w:rPr>
+          <w:rFonts w:ascii="Times New Roman" w:hAnsi="Times New Roman"/>
+          <w:color w:val="FF0000"/>
+          <w:sz w:val="24"/>
+        </w:rPr>
+        <w:t xml:space="preserve"> </w:t>
+      </w:r>
+      <w:r>
+        <w:rPr>
+          <w:rFonts w:ascii="Times New Roman" w:hAnsi="Times New Roman"/>
+          <w:color w:val="000000"/>
+          <w:sz w:val="24"/>
+        </w:rPr>
+        <w:t>Страстотерпці Господні, блаженна земля напоїлася кро</w:t>
+      </w:r>
+      <w:r>
+        <w:rPr>
+          <w:rFonts w:ascii="Times New Roman" w:hAnsi="Times New Roman"/>
+          <w:color w:val="000000"/>
+          <w:sz w:val="24"/>
+        </w:rPr>
+        <w:t xml:space="preserve">в’ю вашою,* і святі оселі прийняли тіла ваші,* бо ви ворога перемогли і Христа зі сміливістю проповідували.* Його ж, як благого, моліть, молимося, щоб спаслися душі наші. </w:t>
+      </w:r>
+    </w:p>
+    <w:p>
+      <w:pPr/>
+      <w:r>
+        <w:rPr>
+          <w:b/>
+        </w:rPr>
+        <w:t xml:space="preserve">Слава, і нині: </w:t>
+      </w:r>
+      <w:r>
+        <w:rPr/>
+        <w:t>богородичний</w:t>
       </w:r>
     </w:p>
     <w:p>

</xml_diff>